<commit_message>
fix(feishu): 对齐 feishu-cli 真实子命令(从 youthful-gates 抽取并复核)
经 riba2534/feishu-cli 官方 README 复核,修正我们也踩到的命令错误:
- 更新已有文档:doc import --doc-id → doc content-update <id> --mode overwrite --markdown
- 新建导入加 --upload-images
- 取 chat_id:feishu-cli chat list(不存在)→ list_chats.py / msg search-chats --query
- 同步修正 sync.sh、feishu/README、.env.example、03-automation/README、
  curriculum/05、Word 生成器,并重生成材料 docx。

来源:并行分支 claude/youthful-gates-b2vv7q 的同名修正(其整体是重复实现,
仅抽取此命令修正,未整体合并)。

Co-Authored-By: Claude Opus 4.8 <noreply@anthropic.com>
Claude-Session: https://claude.ai/code/session_01KCVuupxh3kyVtjhgy4mbw5
</commit_message>
<xml_diff>
--- a/飞书深度打通-技术选型与实施材料.docx
+++ b/飞书深度打通-技术选型与实施材料.docx
@@ -2992,7 +2992,7 @@
         <w:spacing w:after="60"/>
       </w:pPr>
       <w:r>
-        <w:t>把应用机器人拉进目标通知群,用 feishu-cli chat list 取 chat_id;</w:t>
+        <w:t>把应用机器人拉进目标通知群,用 list_chats.py(或 feishu-cli msg search-chats --query)取 chat_id;</w:t>
       </w:r>
     </w:p>
     <w:p>
@@ -3001,7 +3001,7 @@
         <w:spacing w:after="60"/>
       </w:pPr>
       <w:r>
-        <w:t>在飞书手建销售管道多维表格(字段照 fields.example.json),取 app_token / table_id;</w:t>
+        <w:t>建销售管道多维表格(init_pipeline.py 或手建,字段照 fields.example.json),取 app_token / table_id;</w:t>
       </w:r>
     </w:p>
     <w:p>

</xml_diff>